<commit_message>
fix(word): aligner les exercices et les réalisés sur les consignes
Les documents de départ permettent désormais d'arriver aux réalisés
en suivant uniquement les étapes de la formation. Les réalisés
appliquent vraiment les fonctions Word demandées (styles, TDM,
en-têtes, tableaux calculés, images, modèle .dotx, atelier M2).

Co-authored-by: wootwootstyle <wootwootstyle@gmail.com>
</commit_message>
<xml_diff>
--- a/Word/Module 1/DOCX/Exercices/01_Exercice_Texte_brut_Procedure_accueil.docx
+++ b/Word/Module 1/DOCX/Exercices/01_Exercice_Texte_brut_Procedure_accueil.docx
@@ -3,81 +3,178 @@
 <w:document xmlns:wpc="http://schemas.microsoft.com/office/word/2010/wordprocessingCanvas" xmlns:mo="http://schemas.microsoft.com/office/mac/office/2008/main" xmlns:mc="http://schemas.openxmlformats.org/markup-compatibility/2006" xmlns:mv="urn:schemas-microsoft-com:mac:vml" xmlns:o="urn:schemas-microsoft-com:office:office" xmlns:r="http://schemas.openxmlformats.org/officeDocument/2006/relationships" xmlns:m="http://schemas.openxmlformats.org/officeDocument/2006/math" xmlns:v="urn:schemas-microsoft-com:vml" xmlns:wp14="http://schemas.microsoft.com/office/word/2010/wordprocessingDrawing" xmlns:wp="http://schemas.openxmlformats.org/drawingml/2006/wordprocessingDrawing" xmlns:w10="urn:schemas-microsoft-com:office:word" xmlns:w="http://schemas.openxmlformats.org/wordprocessingml/2006/main" xmlns:w14="http://schemas.microsoft.com/office/word/2010/wordml" xmlns:wpg="http://schemas.microsoft.com/office/word/2010/wordprocessingGroup" xmlns:wpi="http://schemas.microsoft.com/office/word/2010/wordprocessingInk" xmlns:wne="http://schemas.microsoft.com/office/word/2006/wordml" xmlns:wps="http://schemas.microsoft.com/office/word/2010/wordprocessingShape" mc:Ignorable="w14 wp14">
   <w:body>
     <w:p>
+      <w:pPr>
+        <w:spacing w:after="160" w:before="0"/>
+      </w:pPr>
       <w:r>
+        <w:rPr>
+          <w:rFonts w:ascii="Calibri" w:hAnsi="Calibri" w:eastAsia="Calibri"/>
+          <w:sz w:val="22"/>
+        </w:rPr>
         <w:t>Procédure interne - Accueil d'un nouveau collaborateur</w:t>
       </w:r>
     </w:p>
     <w:p>
+      <w:pPr>
+        <w:spacing w:after="160" w:before="0"/>
+      </w:pPr>
       <w:r>
-        <w:t>avant l'arrivée</w:t>
+        <w:rPr>
+          <w:rFonts w:ascii="Calibri" w:hAnsi="Calibri" w:eastAsia="Calibri"/>
+          <w:sz w:val="22"/>
+        </w:rPr>
+        <w:t>Avant l'arrivée</w:t>
       </w:r>
     </w:p>
     <w:p>
+      <w:pPr>
+        <w:spacing w:after="160" w:before="0"/>
+      </w:pPr>
       <w:r>
-        <w:t>préparer les accès</w:t>
+        <w:rPr>
+          <w:rFonts w:ascii="Calibri" w:hAnsi="Calibri" w:eastAsia="Calibri"/>
+          <w:sz w:val="22"/>
+        </w:rPr>
+        <w:t>Préparer les accès</w:t>
       </w:r>
     </w:p>
     <w:p>
+      <w:pPr>
+        <w:spacing w:after="160" w:before="0"/>
+      </w:pPr>
       <w:r>
-        <w:t>le responsable vérifie que les demandes d'accès sont introduites avant l'arrivée du collaborateur</w:t>
+        <w:rPr>
+          <w:rFonts w:ascii="Calibri" w:hAnsi="Calibri" w:eastAsia="Calibri"/>
+          <w:sz w:val="22"/>
+        </w:rPr>
+        <w:t>Le responsable vérifie que les demandes d'accès sont introduites avant l'arrivée du collaborateur</w:t>
       </w:r>
     </w:p>
     <w:p>
+      <w:pPr>
+        <w:spacing w:after="160" w:before="0"/>
+      </w:pPr>
       <w:r>
-        <w:t>préparer le matériel</w:t>
+        <w:rPr>
+          <w:rFonts w:ascii="Calibri" w:hAnsi="Calibri" w:eastAsia="Calibri"/>
+          <w:sz w:val="22"/>
+        </w:rPr>
+        <w:t>Préparer le matériel</w:t>
       </w:r>
     </w:p>
     <w:p>
+      <w:pPr>
+        <w:spacing w:after="160" w:before="0"/>
+      </w:pPr>
       <w:r>
-        <w:t>le poste de travail, le badge et les informations utiles sont préparés</w:t>
+        <w:rPr>
+          <w:rFonts w:ascii="Calibri" w:hAnsi="Calibri" w:eastAsia="Calibri"/>
+          <w:sz w:val="22"/>
+        </w:rPr>
+        <w:t>Le poste de travail, le badge et les informations utiles sont préparés</w:t>
       </w:r>
     </w:p>
     <w:p>
+      <w:pPr>
+        <w:spacing w:after="160" w:before="0"/>
+      </w:pPr>
       <w:r>
-        <w:t>le premier jour</w:t>
+        <w:rPr>
+          <w:rFonts w:ascii="Calibri" w:hAnsi="Calibri" w:eastAsia="Calibri"/>
+          <w:sz w:val="22"/>
+        </w:rPr>
+        <w:t>Le premier jour</w:t>
       </w:r>
     </w:p>
     <w:p>
+      <w:pPr>
+        <w:spacing w:after="160" w:before="0"/>
+      </w:pPr>
       <w:r>
-        <w:t>accueil dans l'équipe</w:t>
+        <w:rPr>
+          <w:rFonts w:ascii="Calibri" w:hAnsi="Calibri" w:eastAsia="Calibri"/>
+          <w:sz w:val="22"/>
+        </w:rPr>
+        <w:t>Accueil dans l'équipe</w:t>
       </w:r>
     </w:p>
     <w:p>
+      <w:pPr>
+        <w:spacing w:after="160" w:before="0"/>
+      </w:pPr>
       <w:r>
-        <w:t>présentation des outils</w:t>
+        <w:rPr>
+          <w:rFonts w:ascii="Calibri" w:hAnsi="Calibri" w:eastAsia="Calibri"/>
+          <w:sz w:val="22"/>
+        </w:rPr>
+        <w:t>Présentation des outils</w:t>
       </w:r>
     </w:p>
     <w:p>
+      <w:pPr>
+        <w:spacing w:after="160" w:before="0"/>
+      </w:pPr>
       <w:r>
-        <w:t>les outils principaux sont : session Windows, messagerie, intranet, dossiers partagés</w:t>
+        <w:rPr>
+          <w:rFonts w:ascii="Calibri" w:hAnsi="Calibri" w:eastAsia="Calibri"/>
+          <w:sz w:val="22"/>
+        </w:rPr>
+        <w:t>Les outils principaux sont : session Windows, messagerie, intranet, dossiers partagés</w:t>
       </w:r>
     </w:p>
     <w:p>
+      <w:pPr>
+        <w:spacing w:after="160" w:before="0"/>
+      </w:pPr>
       <w:r>
-        <w:t>après la première semaine</w:t>
+        <w:rPr>
+          <w:rFonts w:ascii="Calibri" w:hAnsi="Calibri" w:eastAsia="Calibri"/>
+          <w:sz w:val="22"/>
+        </w:rPr>
+        <w:t>Après la première semaine</w:t>
       </w:r>
     </w:p>
     <w:p>
+      <w:pPr>
+        <w:spacing w:after="160" w:before="0"/>
+      </w:pPr>
       <w:r>
-        <w:t>point de suivi</w:t>
+        <w:rPr>
+          <w:rFonts w:ascii="Calibri" w:hAnsi="Calibri" w:eastAsia="Calibri"/>
+          <w:sz w:val="22"/>
+        </w:rPr>
+        <w:t>Point de suivi</w:t>
       </w:r>
     </w:p>
     <w:p>
+      <w:pPr>
+        <w:spacing w:after="160" w:before="0"/>
+      </w:pPr>
       <w:r>
-        <w:t>ajustements éventuels</w:t>
+        <w:rPr>
+          <w:rFonts w:ascii="Calibri" w:hAnsi="Calibri" w:eastAsia="Calibri"/>
+          <w:sz w:val="22"/>
+        </w:rPr>
+        <w:t>Ajustements éventuels</w:t>
       </w:r>
     </w:p>
     <w:p>
+      <w:pPr>
+        <w:spacing w:after="240" w:before="0"/>
+      </w:pPr>
       <w:r>
         <w:rPr>
+          <w:rFonts w:ascii="Calibri" w:hAnsi="Calibri" w:eastAsia="Calibri"/>
           <w:i/>
+          <w:color w:val="666666"/>
+          <w:sz w:val="22"/>
         </w:rPr>
-        <w:t>Consigne : appliquez le style Titre au titre principal, puis Titre 1 aux grandes parties, Titre 2 aux sous-parties et Normal au texte. Transformez l'énumération des outils en liste à puces, encadrez le titre principal (bordure + trame légère) et utilisez le pinceau (Reproduire la mise en forme) pour homogénéiser une mise en valeur.</w:t>
+        <w:t>Consigne : appliquez le style Titre au titre principal, puis Titre 1 aux trois grandes parties, Titre 2 aux sous-parties et Normal au texte. Aérez (interligne, espacement) et mettez un mot clé en gras. Transformez l'énumération des outils en liste à puces, encadrez le titre (bordure + trame légère) et reproduisez la mise en valeur avec le pinceau.</w:t>
       </w:r>
     </w:p>
     <w:sectPr>
-      <w:pgSz w:w="12240" w:h="15840"/>
-      <w:pgMar w:top="1440" w:right="1800" w:bottom="1440" w:left="1800" w:header="720" w:footer="720" w:gutter="0"/>
+      <w:pgSz w:w="11906" w:h="16838"/>
+      <w:pgMar w:top="1134" w:right="1417" w:bottom="1134" w:left="1417" w:header="720" w:footer="720" w:gutter="0"/>
       <w:cols w:space="720"/>
       <w:docGrid w:linePitch="360"/>
     </w:sectPr>

</xml_diff>